<commit_message>
docs: explain task inputs and outputs using course terminology
</commit_message>
<xml_diff>
--- a/reports/РПЗ.docx
+++ b/reports/РПЗ.docx
@@ -916,23 +916,23 @@
         <w:pStyle w:val="RPZBody"/>
       </w:pPr>
       <w:r>
-        <w:t xml:space="preserve">Композиционный материал состоит как минимум из двух компонентов. Матрица – связующее, которое удерживает компоненты вместе и передаёт нагрузку. Наполнитель – второй компонент, например волокна, которые усиливают материал. Этот пример поясняет общий принцип и не означает, что состав конкретных строк предоставленных таблиц известен: паспорт материалов отсутствует.</w:t>
-      </w:r>
-    </w:p>
-    <w:p>
-      <w:pPr>
-        <w:pStyle w:val="RPZBody"/>
-      </w:pPr>
-      <w:r>
-        <w:t xml:space="preserve">В работе рассматриваются две механические характеристики при растяжении. В упругой области материал восстанавливает форму после снятия нагрузки. Модуль упругости показывает жёсткость в этой области: чем он выше, тем меньше удлинение при одинаковом напряжении. Напряжение здесь означает нагрузку, делённую на площадь поперечного сечения образца. Прочность при растяжении показывает предельное напряжение перед разрушением. Предварительный прогноз этих величин в перспективе может помочь отбирать варианты для испытаний, но не заменяет само испытание.</w:t>
-      </w:r>
-    </w:p>
-    <w:p>
-      <w:pPr>
-        <w:pStyle w:val="RPZBody"/>
-      </w:pPr>
-      <w:r>
-        <w:t xml:space="preserve">Объект исследования – примеры композиционных материалов из двух предоставленных таблиц. Предмет – способы построения и проверки моделей. Цель работы – выяснить, позволяют ли имеющиеся столбцы оценивать модуль и прочность, а также восстановить записанное соотношение матрицы и наполнителя по 12 остальным полям, включая известные модуль и прочность. Для этого данные проверяются, объединяются и используются для сравнения нескольких методов. Полученная точность невысока, поэтому выводы относятся только к этой таблице.</w:t>
+        <w:t xml:space="preserve">Композиционный материал состоит из нескольких компонентов, которые работают совместно. Матрицей называют связующее, удерживающее их как единое целое. Наполнитель – второй компонент; он может выполнять армирующую функцию, то есть усиливать материал. Свойства готового композита зависят от сочетания компонентов, их соотношения, взаимного расположения и изготовления, поэтому их трудно определить только по свойствам отдельных частей.</w:t>
+      </w:r>
+    </w:p>
+    <w:p>
+      <w:pPr>
+        <w:pStyle w:val="RPZBody"/>
+      </w:pPr>
+      <w:r>
+        <w:t xml:space="preserve">Входными данными служат две таблицы Excel. Для представленных материалов в них записаны характеристики состава и изготовления, в том числе соотношение связующего и наполнителя, плотность, количество отвердителя, потребление смолы и параметры нашивки, а также известные конечные свойства. На этих примерах модели учатся находить зависимость. Для нового набора из 11 входных характеристик нужны два отдельных прогноза. Модуль упругости при растяжении характеризует жёсткость материала при обратимом растяжении, когда после снятия нагрузки восстанавливается исходная форма. Прочность при растяжении – предельное напряжение до разрушения; напряжение означает нагрузку, делённую на площадь поперечного сечения.</w:t>
+      </w:r>
+    </w:p>
+    <w:p>
+      <w:pPr>
+        <w:pStyle w:val="RPZBody"/>
+      </w:pPr>
+      <w:r>
+        <w:t xml:space="preserve">Для решения задачи таблицы объединяют и проверяют, затем данные разделяют на обучающую и тестовую выборки. На обучающей выборке подбирают и сравнивают модели, а тестовую используют для итоговой проверки прогнозов по известным значениям свойств. Выбранные модели включают в демонстрационное приложение. Отдельно нейронная сеть оценивает значение показателя «Соотношение матрица–наполнитель» по 12 остальным известным характеристикам, включая модуль упругости и прочность.</w:t>
       </w:r>
     </w:p>
     <w:p>
@@ -958,31 +958,31 @@
         <w:pStyle w:val="RPZBody"/>
       </w:pPr>
       <w:r>
-        <w:t xml:space="preserve">Каждая строка таблиц рассматривается как один предоставленный пример материала, а столбец – как его характеристика. Файлы соединены по совпадающему индексу после проверки однозначности. Получены 1023 примера и 13 полей; ещё 17 строк были только в X_nup.xlsx и не имели пары. Индекс служит ключом, но не описывает материал и не подаётся модели. Пропуски и нечисловые значения отсутствуют.</w:t>
-      </w:r>
-    </w:p>
-    <w:p>
-      <w:pPr>
-        <w:pStyle w:val="RPZBody"/>
-      </w:pPr>
-      <w:r>
-        <w:t xml:space="preserve">Решаются три задачи прогноза числовой величины. В первых двух модель получает 11 характеристик, в том числе плотность, количество отвердителя, содержание эпоксидных групп, расход смолы и параметры нашивки. По ним отдельно оцениваются модуль и прочность; другая конечная характеристика не используется как подсказка. В третьей задаче сеть получает 12 остальных полей, включая известные модуль и прочность, и восстанавливает записанное отношение матрицы и наполнителя. Это не поиск оптимального состава.</w:t>
-      </w:r>
-    </w:p>
-    <w:p>
-      <w:pPr>
-        <w:pStyle w:val="RPZBody"/>
-      </w:pPr>
-      <w:r>
-        <w:t xml:space="preserve">Не указаны единицы шага и плотности нашивки, смысл суффикса _2, происхождение примеров, серии испытаний и типы компонентов. Эти сведения нельзя восстановить по одним числам, поэтому они зафиксированы как ограничения.</w:t>
-      </w:r>
-    </w:p>
-    <w:p>
-      <w:pPr>
-        <w:pStyle w:val="RPZBody"/>
-      </w:pPr>
-      <w:r>
-        <w:t xml:space="preserve">Три задачи и доступные им входы сопоставлены в таблице 1. Далее описаны использованные методы.</w:t>
+        <w:t xml:space="preserve">Объект исследования – предоставленные числовые данные о композиционных материалах. Предмет исследования – методы построения и проверки моделей, связывающих входные характеристики с модулем упругости и прочностью при растяжении. Цель работы – построить и сравнить такие модели, оценить их на тестовой выборке и создать приложение для получения двух прогнозов по новому набору входных данных.</w:t>
+      </w:r>
+    </w:p>
+    <w:p>
+      <w:pPr>
+        <w:pStyle w:val="RPZBody"/>
+      </w:pPr>
+      <w:r>
+        <w:t xml:space="preserve">Исходные файлы X_bp.xlsx и X_nup.xlsx соединены по совпадающему индексу после проверки его однозначности. Получены 1023 строки и 13 содержательных полей; ещё 17 строк файла X_nup.xlsx не имели пары. Одна строка описывает один представленный пример, столбцы содержат его характеристики и известные значения свойств. Индекс служит только для соединения и не используется моделью.</w:t>
+      </w:r>
+    </w:p>
+    <w:p>
+      <w:pPr>
+        <w:pStyle w:val="RPZBody"/>
+      </w:pPr>
+      <w:r>
+        <w:t xml:space="preserve">В первых двух задачах при обучении известны 11 входных характеристик и значение прогнозируемого свойства. Среди входов есть плотность, количество отвердителя, содержание эпоксидных групп, потребление смолы и параметры нашивки; полный перечень приведён в таблице 4 и словаре данных. Для нового набора входов модуль упругости и прочность неизвестны: модель оценивает каждую величину отдельно, не используя вторую как подсказку. В дополнительной задаче нейронная сеть по 12 остальным известным характеристикам оценивает показатель «Соотношение матрица–наполнитель».</w:t>
+      </w:r>
+    </w:p>
+    <w:p>
+      <w:pPr>
+        <w:pStyle w:val="RPZBody"/>
+      </w:pPr>
+      <w:r>
+        <w:t xml:space="preserve">Данные проверяют и подготавливают, модели обучают на обучающей выборке и настраивают с перекрёстной проверкой, а окончательное качество определяют по тестовой выборке, не участвовавшей в выборе. Три постановки и их входы сопоставлены в таблице 1. Далее описаны использованные методы.</w:t>
       </w:r>
     </w:p>
     <w:p>
@@ -1299,7 +1299,7 @@
                 <w:color w:val="000000"/>
                 <w:sz w:val="24"/>
               </w:rPr>
-              <w:t xml:space="preserve">Оценка записанного отношения по 12 остальным полям</w:t>
+              <w:t xml:space="preserve">Оценка показателя «Соотношение матрица–наполнитель» по 12 остальным характеристикам</w:t>
             </w:r>
           </w:p>
         </w:tc>
@@ -1357,7 +1357,7 @@
         <w:pStyle w:val="RPZBody"/>
       </w:pPr>
       <w:r>
-        <w:t xml:space="preserve">Регрессионная модель учится на примерах с известными входами и числовым ответом, а затем оценивает ответ для нового набора входов. Индекс строки исключён, поскольку это номер, а не характеристика. Для прогноза модуля или прочности другая конечная характеристика также исключена: она может быть неизвестна. Методы реализованы средствами scikit-learn [19].</w:t>
+        <w:t xml:space="preserve">Регрессионная модель учится на строках, где одновременно известны входные характеристики и значение прогнозируемого свойства. Она подбирает зависимость между ними, а затем оценивает свойство для нового набора входов. Для прогноза модуля или прочности другая конечная характеристика исключена из входов, поскольку для нового материала она также может быть неизвестна. Методы реализованы средствами scikit-learn [19].</w:t>
       </w:r>
     </w:p>
     <w:p>

</xml_diff>